<commit_message>
Complete V6 DOCX visual QA
</commit_message>
<xml_diff>
--- a/reports/v6_final_model/ARA-Net_V6_full_manuscript_draft.docx
+++ b/reports/v6_final_model/ARA-Net_V6_full_manuscript_draft.docx
@@ -393,6 +393,10 @@
         <w:gridCol w:w="3371"/>
       </w:tblGrid>
       <w:tr>
+        <w:trPr>
+          <w:cantSplit/>
+          <w:tblHeader w:val="true"/>
+        </w:trPr>
         <w:tc>
           <w:tcPr>
             <w:tcW w:type="dxa" w:w="2620"/>
@@ -507,6 +511,9 @@
         </w:tc>
       </w:tr>
       <w:tr>
+        <w:trPr>
+          <w:cantSplit/>
+        </w:trPr>
         <w:tc>
           <w:tcPr>
             <w:tcW w:type="dxa" w:w="2620"/>
@@ -609,6 +616,9 @@
         </w:tc>
       </w:tr>
       <w:tr>
+        <w:trPr>
+          <w:cantSplit/>
+        </w:trPr>
         <w:tc>
           <w:tcPr>
             <w:tcW w:type="dxa" w:w="2620"/>
@@ -711,6 +721,9 @@
         </w:tc>
       </w:tr>
       <w:tr>
+        <w:trPr>
+          <w:cantSplit/>
+        </w:trPr>
         <w:tc>
           <w:tcPr>
             <w:tcW w:type="dxa" w:w="2620"/>
@@ -813,6 +826,9 @@
         </w:tc>
       </w:tr>
       <w:tr>
+        <w:trPr>
+          <w:cantSplit/>
+        </w:trPr>
         <w:tc>
           <w:tcPr>
             <w:tcW w:type="dxa" w:w="2620"/>
@@ -915,6 +931,9 @@
         </w:tc>
       </w:tr>
       <w:tr>
+        <w:trPr>
+          <w:cantSplit/>
+        </w:trPr>
         <w:tc>
           <w:tcPr>
             <w:tcW w:type="dxa" w:w="2620"/>
@@ -1017,6 +1036,9 @@
         </w:tc>
       </w:tr>
       <w:tr>
+        <w:trPr>
+          <w:cantSplit/>
+        </w:trPr>
         <w:tc>
           <w:tcPr>
             <w:tcW w:type="dxa" w:w="2620"/>
@@ -1119,6 +1141,9 @@
         </w:tc>
       </w:tr>
       <w:tr>
+        <w:trPr>
+          <w:cantSplit/>
+        </w:trPr>
         <w:tc>
           <w:tcPr>
             <w:tcW w:type="dxa" w:w="2620"/>
@@ -1221,6 +1246,9 @@
         </w:tc>
       </w:tr>
       <w:tr>
+        <w:trPr>
+          <w:cantSplit/>
+        </w:trPr>
         <w:tc>
           <w:tcPr>
             <w:tcW w:type="dxa" w:w="2620"/>
@@ -1497,7 +1525,7 @@
           <w:rFonts w:ascii="Calibri" w:hAnsi="Calibri"/>
           <w:sz w:val="22"/>
         </w:rPr>
-        <w:t>Let p_{m,k}(x_i) denote the class probability for scan i, class k, and base model m, where k \in \{\mathrm{CN}, \mathrm{MCI}, \mathrm{AD}\}. The final ensemble uses log-probability pooling:</w:t>
+        <w:t>Let p_{m,k}(x_i) denote the class probability for scan i, class k, and base model m, where k in {CN, MCI, AD}. The final ensemble uses log-probability pooling:</w:t>
       </w:r>
     </w:p>
     <w:p>
@@ -1510,7 +1538,7 @@
           <w:rFonts w:ascii="Calibri" w:hAnsi="Calibri"/>
           <w:sz w:val="21"/>
         </w:rPr>
-        <w:t>z_{i,k} = \frac{1}{T}\sum_{m=1}^{M} w_m \log(\max(p_{m,k}(x_i), \epsilon)) + b_k ,</w:t>
+        <w:t>z_{i,k} = (1/T) sum_{m=1..M} w_m log(max(p_{m,k}(x_i), epsilon)) + b_k, for k in {CN, MCI, AD}</w:t>
       </w:r>
     </w:p>
     <w:p>
@@ -1522,7 +1550,7 @@
           <w:rFonts w:ascii="Calibri" w:hAnsi="Calibri"/>
           <w:sz w:val="22"/>
         </w:rPr>
-        <w:t>where w_m \ge 0, \sum_m w_m = 1, T is a temperature parameter, b_k is a class-specific offset, and \epsilon prevents numerical underflow. Calibrated class probabilities are:</w:t>
+        <w:t>where w_m &gt;= 0, sum_m w_m = 1, T is a temperature parameter, b_k is a class-specific offset, and epsilon prevents numerical underflow. Calibrated class probabilities are:</w:t>
       </w:r>
     </w:p>
     <w:p>
@@ -1535,7 +1563,7 @@
           <w:rFonts w:ascii="Calibri" w:hAnsi="Calibri"/>
           <w:sz w:val="21"/>
         </w:rPr>
-        <w:t>\tilde{p}_{i,k} = \frac{\exp(z_{i,k})}{\sum_c \exp(z_{i,c})}.</w:t>
+        <w:t>p_tilde_{i,k} = exp(z_{i,k}) / sum_c exp(z_{i,c})</w:t>
       </w:r>
     </w:p>
     <w:p>
@@ -1560,7 +1588,7 @@
           <w:rFonts w:ascii="Calibri" w:hAnsi="Calibri"/>
           <w:sz w:val="21"/>
         </w:rPr>
-        <w:t>\bar{p}_{s,k} = \frac{1}{n_s}\sum_{i \in s}\tilde{p}_{i,k}, \qquad \hat{y}_s = \arg\max_k \bar{p}_{s,k}.</w:t>
+        <w:t>p_bar_{s,k} = (1/n_s) sum_{i in s} p_tilde_{i,k}; y_hat_s = argmax_k p_bar_{s,k}</w:t>
       </w:r>
     </w:p>
     <w:p>
@@ -1810,6 +1838,11 @@
         <w:t>Table 2 summarizes the main external classification results.</w:t>
       </w:r>
     </w:p>
+    <w:p>
+      <w:r>
+        <w:br w:type="page"/>
+      </w:r>
+    </w:p>
     <w:tbl>
       <w:tblPr>
         <w:tblW w:type="dxa" w:w="9360"/>
@@ -1819,26 +1852,30 @@
         <w:tblCellMar>
           <w:top w:w="80" w:type="dxa"/>
           <w:bottom w:w="80" w:type="dxa"/>
-          <w:start w:w="120" w:type="dxa"/>
-          <w:end w:w="120" w:type="dxa"/>
+          <w:start w:w="90" w:type="dxa"/>
+          <w:end w:w="90" w:type="dxa"/>
         </w:tblCellMar>
       </w:tblPr>
       <w:tblGrid>
-        <w:gridCol w:w="1191"/>
-        <w:gridCol w:w="720"/>
+        <w:gridCol w:w="1180"/>
+        <w:gridCol w:w="700"/>
         <w:gridCol w:w="850"/>
-        <w:gridCol w:w="850"/>
-        <w:gridCol w:w="720"/>
-        <w:gridCol w:w="720"/>
-        <w:gridCol w:w="850"/>
-        <w:gridCol w:w="1191"/>
-        <w:gridCol w:w="1021"/>
-        <w:gridCol w:w="1247"/>
+        <w:gridCol w:w="820"/>
+        <w:gridCol w:w="620"/>
+        <w:gridCol w:w="620"/>
+        <w:gridCol w:w="760"/>
+        <w:gridCol w:w="1180"/>
+        <w:gridCol w:w="1040"/>
+        <w:gridCol w:w="1590"/>
       </w:tblGrid>
       <w:tr>
+        <w:trPr>
+          <w:cantSplit/>
+          <w:tblHeader w:val="true"/>
+        </w:trPr>
         <w:tc>
           <w:tcPr>
-            <w:tcW w:type="dxa" w:w="1191"/>
+            <w:tcW w:type="dxa" w:w="1180"/>
             <w:vAlign w:val="center"/>
             <w:tcBorders>
               <w:top w:val="single" w:sz="4" w:space="0" w:color="C9D1D9"/>
@@ -1858,7 +1895,7 @@
                 <w:rFonts w:ascii="Calibri" w:hAnsi="Calibri"/>
                 <w:b/>
                 <w:color w:val="1F3A5F"/>
-                <w:sz w:val="18"/>
+                <w:sz w:val="16"/>
               </w:rPr>
               <w:t>model/protocol</w:t>
             </w:r>
@@ -1866,7 +1903,7 @@
         </w:tc>
         <w:tc>
           <w:tcPr>
-            <w:tcW w:type="dxa" w:w="720"/>
+            <w:tcW w:type="dxa" w:w="700"/>
             <w:vAlign w:val="center"/>
             <w:tcBorders>
               <w:top w:val="single" w:sz="4" w:space="0" w:color="C9D1D9"/>
@@ -1886,7 +1923,7 @@
                 <w:rFonts w:ascii="Calibri" w:hAnsi="Calibri"/>
                 <w:b/>
                 <w:color w:val="1F3A5F"/>
-                <w:sz w:val="18"/>
+                <w:sz w:val="16"/>
               </w:rPr>
               <w:t>unit</w:t>
             </w:r>
@@ -1914,7 +1951,7 @@
                 <w:rFonts w:ascii="Calibri" w:hAnsi="Calibri"/>
                 <w:b/>
                 <w:color w:val="1F3A5F"/>
-                <w:sz w:val="18"/>
+                <w:sz w:val="16"/>
               </w:rPr>
               <w:t>test cohort</w:t>
             </w:r>
@@ -1922,7 +1959,7 @@
         </w:tc>
         <w:tc>
           <w:tcPr>
-            <w:tcW w:type="dxa" w:w="850"/>
+            <w:tcW w:type="dxa" w:w="820"/>
             <w:vAlign w:val="center"/>
             <w:tcBorders>
               <w:top w:val="single" w:sz="4" w:space="0" w:color="C9D1D9"/>
@@ -1942,7 +1979,7 @@
                 <w:rFonts w:ascii="Calibri" w:hAnsi="Calibri"/>
                 <w:b/>
                 <w:color w:val="1F3A5F"/>
-                <w:sz w:val="18"/>
+                <w:sz w:val="16"/>
               </w:rPr>
               <w:t>endpoint n</w:t>
             </w:r>
@@ -1950,7 +1987,7 @@
         </w:tc>
         <w:tc>
           <w:tcPr>
-            <w:tcW w:type="dxa" w:w="720"/>
+            <w:tcW w:type="dxa" w:w="620"/>
             <w:vAlign w:val="center"/>
             <w:tcBorders>
               <w:top w:val="single" w:sz="4" w:space="0" w:color="C9D1D9"/>
@@ -1970,7 +2007,7 @@
                 <w:rFonts w:ascii="Calibri" w:hAnsi="Calibri"/>
                 <w:b/>
                 <w:color w:val="1F3A5F"/>
-                <w:sz w:val="18"/>
+                <w:sz w:val="16"/>
               </w:rPr>
               <w:t>Acc</w:t>
             </w:r>
@@ -1978,7 +2015,7 @@
         </w:tc>
         <w:tc>
           <w:tcPr>
-            <w:tcW w:type="dxa" w:w="720"/>
+            <w:tcW w:type="dxa" w:w="620"/>
             <w:vAlign w:val="center"/>
             <w:tcBorders>
               <w:top w:val="single" w:sz="4" w:space="0" w:color="C9D1D9"/>
@@ -1998,7 +2035,7 @@
                 <w:rFonts w:ascii="Calibri" w:hAnsi="Calibri"/>
                 <w:b/>
                 <w:color w:val="1F3A5F"/>
-                <w:sz w:val="18"/>
+                <w:sz w:val="16"/>
               </w:rPr>
               <w:t>BAcc</w:t>
             </w:r>
@@ -2006,7 +2043,7 @@
         </w:tc>
         <w:tc>
           <w:tcPr>
-            <w:tcW w:type="dxa" w:w="850"/>
+            <w:tcW w:type="dxa" w:w="760"/>
             <w:vAlign w:val="center"/>
             <w:tcBorders>
               <w:top w:val="single" w:sz="4" w:space="0" w:color="C9D1D9"/>
@@ -2026,7 +2063,7 @@
                 <w:rFonts w:ascii="Calibri" w:hAnsi="Calibri"/>
                 <w:b/>
                 <w:color w:val="1F3A5F"/>
-                <w:sz w:val="18"/>
+                <w:sz w:val="16"/>
               </w:rPr>
               <w:t>macro AUC</w:t>
             </w:r>
@@ -2034,7 +2071,7 @@
         </w:tc>
         <w:tc>
           <w:tcPr>
-            <w:tcW w:type="dxa" w:w="1191"/>
+            <w:tcW w:type="dxa" w:w="1180"/>
             <w:vAlign w:val="center"/>
             <w:tcBorders>
               <w:top w:val="single" w:sz="4" w:space="0" w:color="C9D1D9"/>
@@ -2054,7 +2091,7 @@
                 <w:rFonts w:ascii="Calibri" w:hAnsi="Calibri"/>
                 <w:b/>
                 <w:color w:val="1F3A5F"/>
-                <w:sz w:val="18"/>
+                <w:sz w:val="16"/>
               </w:rPr>
               <w:t>AD-vs-CN AUC or CN retention</w:t>
             </w:r>
@@ -2062,7 +2099,7 @@
         </w:tc>
         <w:tc>
           <w:tcPr>
-            <w:tcW w:type="dxa" w:w="1021"/>
+            <w:tcW w:type="dxa" w:w="1040"/>
             <w:vAlign w:val="center"/>
             <w:tcBorders>
               <w:top w:val="single" w:sz="4" w:space="0" w:color="C9D1D9"/>
@@ -2082,7 +2119,7 @@
                 <w:rFonts w:ascii="Calibri" w:hAnsi="Calibri"/>
                 <w:b/>
                 <w:color w:val="1F3A5F"/>
-                <w:sz w:val="18"/>
+                <w:sz w:val="16"/>
               </w:rPr>
               <w:t>CN/MCI/AD recall</w:t>
             </w:r>
@@ -2090,7 +2127,7 @@
         </w:tc>
         <w:tc>
           <w:tcPr>
-            <w:tcW w:type="dxa" w:w="1247"/>
+            <w:tcW w:type="dxa" w:w="1590"/>
             <w:vAlign w:val="center"/>
             <w:tcBorders>
               <w:top w:val="single" w:sz="4" w:space="0" w:color="C9D1D9"/>
@@ -2110,7 +2147,7 @@
                 <w:rFonts w:ascii="Calibri" w:hAnsi="Calibri"/>
                 <w:b/>
                 <w:color w:val="1F3A5F"/>
-                <w:sz w:val="18"/>
+                <w:sz w:val="16"/>
               </w:rPr>
               <w:t>role</w:t>
             </w:r>
@@ -2118,9 +2155,12 @@
         </w:tc>
       </w:tr>
       <w:tr>
+        <w:trPr>
+          <w:cantSplit/>
+        </w:trPr>
         <w:tc>
           <w:tcPr>
-            <w:tcW w:type="dxa" w:w="1191"/>
+            <w:tcW w:type="dxa" w:w="1180"/>
             <w:vAlign w:val="center"/>
             <w:tcBorders>
               <w:top w:val="single" w:sz="4" w:space="0" w:color="C9D1D9"/>
@@ -2137,7 +2177,7 @@
             <w:r>
               <w:rPr>
                 <w:rFonts w:ascii="Calibri" w:hAnsi="Calibri"/>
-                <w:sz w:val="18"/>
+                <w:sz w:val="16"/>
               </w:rPr>
               <w:t>Old v3 ensemble</w:t>
             </w:r>
@@ -2145,7 +2185,7 @@
         </w:tc>
         <w:tc>
           <w:tcPr>
-            <w:tcW w:type="dxa" w:w="720"/>
+            <w:tcW w:type="dxa" w:w="700"/>
             <w:vAlign w:val="center"/>
             <w:tcBorders>
               <w:top w:val="single" w:sz="4" w:space="0" w:color="C9D1D9"/>
@@ -2162,7 +2202,7 @@
             <w:r>
               <w:rPr>
                 <w:rFonts w:ascii="Calibri" w:hAnsi="Calibri"/>
-                <w:sz w:val="18"/>
+                <w:sz w:val="16"/>
               </w:rPr>
               <w:t>scan</w:t>
             </w:r>
@@ -2187,7 +2227,7 @@
             <w:r>
               <w:rPr>
                 <w:rFonts w:ascii="Calibri" w:hAnsi="Calibri"/>
-                <w:sz w:val="18"/>
+                <w:sz w:val="16"/>
               </w:rPr>
               <w:t>AIBL external</w:t>
             </w:r>
@@ -2195,7 +2235,7 @@
         </w:tc>
         <w:tc>
           <w:tcPr>
-            <w:tcW w:type="dxa" w:w="850"/>
+            <w:tcW w:type="dxa" w:w="820"/>
             <w:vAlign w:val="center"/>
             <w:tcBorders>
               <w:top w:val="single" w:sz="4" w:space="0" w:color="C9D1D9"/>
@@ -2212,7 +2252,7 @@
             <w:r>
               <w:rPr>
                 <w:rFonts w:ascii="Calibri" w:hAnsi="Calibri"/>
-                <w:sz w:val="18"/>
+                <w:sz w:val="16"/>
               </w:rPr>
               <w:t>1307</w:t>
             </w:r>
@@ -2220,7 +2260,7 @@
         </w:tc>
         <w:tc>
           <w:tcPr>
-            <w:tcW w:type="dxa" w:w="720"/>
+            <w:tcW w:type="dxa" w:w="620"/>
             <w:vAlign w:val="center"/>
             <w:tcBorders>
               <w:top w:val="single" w:sz="4" w:space="0" w:color="C9D1D9"/>
@@ -2237,7 +2277,7 @@
             <w:r>
               <w:rPr>
                 <w:rFonts w:ascii="Calibri" w:hAnsi="Calibri"/>
-                <w:sz w:val="18"/>
+                <w:sz w:val="16"/>
               </w:rPr>
               <w:t>0.606</w:t>
             </w:r>
@@ -2245,7 +2285,7 @@
         </w:tc>
         <w:tc>
           <w:tcPr>
-            <w:tcW w:type="dxa" w:w="720"/>
+            <w:tcW w:type="dxa" w:w="620"/>
             <w:vAlign w:val="center"/>
             <w:tcBorders>
               <w:top w:val="single" w:sz="4" w:space="0" w:color="C9D1D9"/>
@@ -2262,7 +2302,7 @@
             <w:r>
               <w:rPr>
                 <w:rFonts w:ascii="Calibri" w:hAnsi="Calibri"/>
-                <w:sz w:val="18"/>
+                <w:sz w:val="16"/>
               </w:rPr>
               <w:t>0.399</w:t>
             </w:r>
@@ -2270,7 +2310,7 @@
         </w:tc>
         <w:tc>
           <w:tcPr>
-            <w:tcW w:type="dxa" w:w="850"/>
+            <w:tcW w:type="dxa" w:w="760"/>
             <w:vAlign w:val="center"/>
             <w:tcBorders>
               <w:top w:val="single" w:sz="4" w:space="0" w:color="C9D1D9"/>
@@ -2287,7 +2327,7 @@
             <w:r>
               <w:rPr>
                 <w:rFonts w:ascii="Calibri" w:hAnsi="Calibri"/>
-                <w:sz w:val="18"/>
+                <w:sz w:val="16"/>
               </w:rPr>
               <w:t>0.597</w:t>
             </w:r>
@@ -2295,7 +2335,7 @@
         </w:tc>
         <w:tc>
           <w:tcPr>
-            <w:tcW w:type="dxa" w:w="1191"/>
+            <w:tcW w:type="dxa" w:w="1180"/>
             <w:vAlign w:val="center"/>
             <w:tcBorders>
               <w:top w:val="single" w:sz="4" w:space="0" w:color="C9D1D9"/>
@@ -2312,7 +2352,7 @@
             <w:r>
               <w:rPr>
                 <w:rFonts w:ascii="Calibri" w:hAnsi="Calibri"/>
-                <w:sz w:val="18"/>
+                <w:sz w:val="16"/>
               </w:rPr>
               <w:t>NA</w:t>
             </w:r>
@@ -2320,7 +2360,7 @@
         </w:tc>
         <w:tc>
           <w:tcPr>
-            <w:tcW w:type="dxa" w:w="1021"/>
+            <w:tcW w:type="dxa" w:w="1040"/>
             <w:vAlign w:val="center"/>
             <w:tcBorders>
               <w:top w:val="single" w:sz="4" w:space="0" w:color="C9D1D9"/>
@@ -2337,7 +2377,7 @@
             <w:r>
               <w:rPr>
                 <w:rFonts w:ascii="Calibri" w:hAnsi="Calibri"/>
-                <w:sz w:val="18"/>
+                <w:sz w:val="16"/>
               </w:rPr>
               <w:t>NA</w:t>
             </w:r>
@@ -2345,7 +2385,7 @@
         </w:tc>
         <w:tc>
           <w:tcPr>
-            <w:tcW w:type="dxa" w:w="1247"/>
+            <w:tcW w:type="dxa" w:w="1590"/>
             <w:vAlign w:val="center"/>
             <w:tcBorders>
               <w:top w:val="single" w:sz="4" w:space="0" w:color="C9D1D9"/>
@@ -2362,7 +2402,7 @@
             <w:r>
               <w:rPr>
                 <w:rFonts w:ascii="Calibri" w:hAnsi="Calibri"/>
-                <w:sz w:val="18"/>
+                <w:sz w:val="16"/>
               </w:rPr>
               <w:t>Failed external baseline</w:t>
             </w:r>
@@ -2370,9 +2410,12 @@
         </w:tc>
       </w:tr>
       <w:tr>
+        <w:trPr>
+          <w:cantSplit/>
+        </w:trPr>
         <w:tc>
           <w:tcPr>
-            <w:tcW w:type="dxa" w:w="1191"/>
+            <w:tcW w:type="dxa" w:w="1180"/>
             <w:vAlign w:val="center"/>
             <w:tcBorders>
               <w:top w:val="single" w:sz="4" w:space="0" w:color="C9D1D9"/>
@@ -2389,7 +2432,7 @@
             <w:r>
               <w:rPr>
                 <w:rFonts w:ascii="Calibri" w:hAnsi="Calibri"/>
-                <w:sz w:val="18"/>
+                <w:sz w:val="16"/>
               </w:rPr>
               <w:t>Old v3 ensemble</w:t>
             </w:r>
@@ -2397,7 +2440,7 @@
         </w:tc>
         <w:tc>
           <w:tcPr>
-            <w:tcW w:type="dxa" w:w="720"/>
+            <w:tcW w:type="dxa" w:w="700"/>
             <w:vAlign w:val="center"/>
             <w:tcBorders>
               <w:top w:val="single" w:sz="4" w:space="0" w:color="C9D1D9"/>
@@ -2414,7 +2457,7 @@
             <w:r>
               <w:rPr>
                 <w:rFonts w:ascii="Calibri" w:hAnsi="Calibri"/>
-                <w:sz w:val="18"/>
+                <w:sz w:val="16"/>
               </w:rPr>
               <w:t>scan</w:t>
             </w:r>
@@ -2439,7 +2482,7 @@
             <w:r>
               <w:rPr>
                 <w:rFonts w:ascii="Calibri" w:hAnsi="Calibri"/>
-                <w:sz w:val="18"/>
+                <w:sz w:val="16"/>
               </w:rPr>
               <w:t>IXI healthy</w:t>
             </w:r>
@@ -2447,7 +2490,7 @@
         </w:tc>
         <w:tc>
           <w:tcPr>
-            <w:tcW w:type="dxa" w:w="850"/>
+            <w:tcW w:type="dxa" w:w="820"/>
             <w:vAlign w:val="center"/>
             <w:tcBorders>
               <w:top w:val="single" w:sz="4" w:space="0" w:color="C9D1D9"/>
@@ -2464,7 +2507,7 @@
             <w:r>
               <w:rPr>
                 <w:rFonts w:ascii="Calibri" w:hAnsi="Calibri"/>
-                <w:sz w:val="18"/>
+                <w:sz w:val="16"/>
               </w:rPr>
               <w:t>581</w:t>
             </w:r>
@@ -2472,7 +2515,7 @@
         </w:tc>
         <w:tc>
           <w:tcPr>
-            <w:tcW w:type="dxa" w:w="720"/>
+            <w:tcW w:type="dxa" w:w="620"/>
             <w:vAlign w:val="center"/>
             <w:tcBorders>
               <w:top w:val="single" w:sz="4" w:space="0" w:color="C9D1D9"/>
@@ -2489,7 +2532,7 @@
             <w:r>
               <w:rPr>
                 <w:rFonts w:ascii="Calibri" w:hAnsi="Calibri"/>
-                <w:sz w:val="18"/>
+                <w:sz w:val="16"/>
               </w:rPr>
               <w:t>0.439</w:t>
             </w:r>
@@ -2497,7 +2540,7 @@
         </w:tc>
         <w:tc>
           <w:tcPr>
-            <w:tcW w:type="dxa" w:w="720"/>
+            <w:tcW w:type="dxa" w:w="620"/>
             <w:vAlign w:val="center"/>
             <w:tcBorders>
               <w:top w:val="single" w:sz="4" w:space="0" w:color="C9D1D9"/>
@@ -2514,7 +2557,7 @@
             <w:r>
               <w:rPr>
                 <w:rFonts w:ascii="Calibri" w:hAnsi="Calibri"/>
-                <w:sz w:val="18"/>
+                <w:sz w:val="16"/>
               </w:rPr>
               <w:t>0.439</w:t>
             </w:r>
@@ -2522,7 +2565,7 @@
         </w:tc>
         <w:tc>
           <w:tcPr>
-            <w:tcW w:type="dxa" w:w="850"/>
+            <w:tcW w:type="dxa" w:w="760"/>
             <w:vAlign w:val="center"/>
             <w:tcBorders>
               <w:top w:val="single" w:sz="4" w:space="0" w:color="C9D1D9"/>
@@ -2539,7 +2582,7 @@
             <w:r>
               <w:rPr>
                 <w:rFonts w:ascii="Calibri" w:hAnsi="Calibri"/>
-                <w:sz w:val="18"/>
+                <w:sz w:val="16"/>
               </w:rPr>
               <w:t>NA</w:t>
             </w:r>
@@ -2547,7 +2590,7 @@
         </w:tc>
         <w:tc>
           <w:tcPr>
-            <w:tcW w:type="dxa" w:w="1191"/>
+            <w:tcW w:type="dxa" w:w="1180"/>
             <w:vAlign w:val="center"/>
             <w:tcBorders>
               <w:top w:val="single" w:sz="4" w:space="0" w:color="C9D1D9"/>
@@ -2564,7 +2607,7 @@
             <w:r>
               <w:rPr>
                 <w:rFonts w:ascii="Calibri" w:hAnsi="Calibri"/>
-                <w:sz w:val="18"/>
+                <w:sz w:val="16"/>
               </w:rPr>
               <w:t>CN retention 0.439</w:t>
             </w:r>
@@ -2572,7 +2615,7 @@
         </w:tc>
         <w:tc>
           <w:tcPr>
-            <w:tcW w:type="dxa" w:w="1021"/>
+            <w:tcW w:type="dxa" w:w="1040"/>
             <w:vAlign w:val="center"/>
             <w:tcBorders>
               <w:top w:val="single" w:sz="4" w:space="0" w:color="C9D1D9"/>
@@ -2589,7 +2632,7 @@
             <w:r>
               <w:rPr>
                 <w:rFonts w:ascii="Calibri" w:hAnsi="Calibri"/>
-                <w:sz w:val="18"/>
+                <w:sz w:val="16"/>
               </w:rPr>
               <w:t>0.439/0.000/0.000</w:t>
             </w:r>
@@ -2597,7 +2640,7 @@
         </w:tc>
         <w:tc>
           <w:tcPr>
-            <w:tcW w:type="dxa" w:w="1247"/>
+            <w:tcW w:type="dxa" w:w="1590"/>
             <w:vAlign w:val="center"/>
             <w:tcBorders>
               <w:top w:val="single" w:sz="4" w:space="0" w:color="C9D1D9"/>
@@ -2614,7 +2657,7 @@
             <w:r>
               <w:rPr>
                 <w:rFonts w:ascii="Calibri" w:hAnsi="Calibri"/>
-                <w:sz w:val="18"/>
+                <w:sz w:val="16"/>
               </w:rPr>
               <w:t>Failed healthy specificity baseline</w:t>
             </w:r>
@@ -2622,9 +2665,12 @@
         </w:tc>
       </w:tr>
       <w:tr>
+        <w:trPr>
+          <w:cantSplit/>
+        </w:trPr>
         <w:tc>
           <w:tcPr>
-            <w:tcW w:type="dxa" w:w="1191"/>
+            <w:tcW w:type="dxa" w:w="1180"/>
             <w:vAlign w:val="center"/>
             <w:tcBorders>
               <w:top w:val="single" w:sz="4" w:space="0" w:color="C9D1D9"/>
@@ -2641,7 +2687,7 @@
             <w:r>
               <w:rPr>
                 <w:rFonts w:ascii="Calibri" w:hAnsi="Calibri"/>
-                <w:sz w:val="18"/>
+                <w:sz w:val="16"/>
               </w:rPr>
               <w:t>v4 atlas+clinical HGB</w:t>
             </w:r>
@@ -2649,7 +2695,7 @@
         </w:tc>
         <w:tc>
           <w:tcPr>
-            <w:tcW w:type="dxa" w:w="720"/>
+            <w:tcW w:type="dxa" w:w="700"/>
             <w:vAlign w:val="center"/>
             <w:tcBorders>
               <w:top w:val="single" w:sz="4" w:space="0" w:color="C9D1D9"/>
@@ -2666,7 +2712,7 @@
             <w:r>
               <w:rPr>
                 <w:rFonts w:ascii="Calibri" w:hAnsi="Calibri"/>
-                <w:sz w:val="18"/>
+                <w:sz w:val="16"/>
               </w:rPr>
               <w:t>scan</w:t>
             </w:r>
@@ -2691,7 +2737,7 @@
             <w:r>
               <w:rPr>
                 <w:rFonts w:ascii="Calibri" w:hAnsi="Calibri"/>
-                <w:sz w:val="18"/>
+                <w:sz w:val="16"/>
               </w:rPr>
               <w:t>AIBL heldout</w:t>
             </w:r>
@@ -2699,7 +2745,7 @@
         </w:tc>
         <w:tc>
           <w:tcPr>
-            <w:tcW w:type="dxa" w:w="850"/>
+            <w:tcW w:type="dxa" w:w="820"/>
             <w:vAlign w:val="center"/>
             <w:tcBorders>
               <w:top w:val="single" w:sz="4" w:space="0" w:color="C9D1D9"/>
@@ -2716,7 +2762,7 @@
             <w:r>
               <w:rPr>
                 <w:rFonts w:ascii="Calibri" w:hAnsi="Calibri"/>
-                <w:sz w:val="18"/>
+                <w:sz w:val="16"/>
               </w:rPr>
               <w:t>397</w:t>
             </w:r>
@@ -2724,7 +2770,7 @@
         </w:tc>
         <w:tc>
           <w:tcPr>
-            <w:tcW w:type="dxa" w:w="720"/>
+            <w:tcW w:type="dxa" w:w="620"/>
             <w:vAlign w:val="center"/>
             <w:tcBorders>
               <w:top w:val="single" w:sz="4" w:space="0" w:color="C9D1D9"/>
@@ -2741,7 +2787,7 @@
             <w:r>
               <w:rPr>
                 <w:rFonts w:ascii="Calibri" w:hAnsi="Calibri"/>
-                <w:sz w:val="18"/>
+                <w:sz w:val="16"/>
               </w:rPr>
               <w:t>0.882</w:t>
             </w:r>
@@ -2749,7 +2795,7 @@
         </w:tc>
         <w:tc>
           <w:tcPr>
-            <w:tcW w:type="dxa" w:w="720"/>
+            <w:tcW w:type="dxa" w:w="620"/>
             <w:vAlign w:val="center"/>
             <w:tcBorders>
               <w:top w:val="single" w:sz="4" w:space="0" w:color="C9D1D9"/>
@@ -2766,7 +2812,7 @@
             <w:r>
               <w:rPr>
                 <w:rFonts w:ascii="Calibri" w:hAnsi="Calibri"/>
-                <w:sz w:val="18"/>
+                <w:sz w:val="16"/>
               </w:rPr>
               <w:t>0.741</w:t>
             </w:r>
@@ -2774,7 +2820,7 @@
         </w:tc>
         <w:tc>
           <w:tcPr>
-            <w:tcW w:type="dxa" w:w="850"/>
+            <w:tcW w:type="dxa" w:w="760"/>
             <w:vAlign w:val="center"/>
             <w:tcBorders>
               <w:top w:val="single" w:sz="4" w:space="0" w:color="C9D1D9"/>
@@ -2791,7 +2837,7 @@
             <w:r>
               <w:rPr>
                 <w:rFonts w:ascii="Calibri" w:hAnsi="Calibri"/>
-                <w:sz w:val="18"/>
+                <w:sz w:val="16"/>
               </w:rPr>
               <w:t>0.942</w:t>
             </w:r>
@@ -2799,7 +2845,7 @@
         </w:tc>
         <w:tc>
           <w:tcPr>
-            <w:tcW w:type="dxa" w:w="1191"/>
+            <w:tcW w:type="dxa" w:w="1180"/>
             <w:vAlign w:val="center"/>
             <w:tcBorders>
               <w:top w:val="single" w:sz="4" w:space="0" w:color="C9D1D9"/>
@@ -2816,7 +2862,7 @@
             <w:r>
               <w:rPr>
                 <w:rFonts w:ascii="Calibri" w:hAnsi="Calibri"/>
-                <w:sz w:val="18"/>
+                <w:sz w:val="16"/>
               </w:rPr>
               <w:t>AD-vs-CN AUC 0.990</w:t>
             </w:r>
@@ -2824,7 +2870,7 @@
         </w:tc>
         <w:tc>
           <w:tcPr>
-            <w:tcW w:type="dxa" w:w="1021"/>
+            <w:tcW w:type="dxa" w:w="1040"/>
             <w:vAlign w:val="center"/>
             <w:tcBorders>
               <w:top w:val="single" w:sz="4" w:space="0" w:color="C9D1D9"/>
@@ -2841,7 +2887,7 @@
             <w:r>
               <w:rPr>
                 <w:rFonts w:ascii="Calibri" w:hAnsi="Calibri"/>
-                <w:sz w:val="18"/>
+                <w:sz w:val="16"/>
               </w:rPr>
               <w:t>0.964/0.528/0.732</w:t>
             </w:r>
@@ -2849,7 +2895,7 @@
         </w:tc>
         <w:tc>
           <w:tcPr>
-            <w:tcW w:type="dxa" w:w="1247"/>
+            <w:tcW w:type="dxa" w:w="1590"/>
             <w:vAlign w:val="center"/>
             <w:tcBorders>
               <w:top w:val="single" w:sz="4" w:space="0" w:color="C9D1D9"/>
@@ -2866,7 +2912,7 @@
             <w:r>
               <w:rPr>
                 <w:rFonts w:ascii="Calibri" w:hAnsi="Calibri"/>
-                <w:sz w:val="18"/>
+                <w:sz w:val="16"/>
               </w:rPr>
               <w:t>Earlier rebuilt atlas-guided model</w:t>
             </w:r>
@@ -2874,9 +2920,12 @@
         </w:tc>
       </w:tr>
       <w:tr>
+        <w:trPr>
+          <w:cantSplit/>
+        </w:trPr>
         <w:tc>
           <w:tcPr>
-            <w:tcW w:type="dxa" w:w="1191"/>
+            <w:tcW w:type="dxa" w:w="1180"/>
             <w:vAlign w:val="center"/>
             <w:tcBorders>
               <w:top w:val="single" w:sz="4" w:space="0" w:color="C9D1D9"/>
@@ -2893,7 +2942,7 @@
             <w:r>
               <w:rPr>
                 <w:rFonts w:ascii="Calibri" w:hAnsi="Calibri"/>
-                <w:sz w:val="18"/>
+                <w:sz w:val="16"/>
               </w:rPr>
               <w:t>Final rescue ensemble</w:t>
             </w:r>
@@ -2901,7 +2950,7 @@
         </w:tc>
         <w:tc>
           <w:tcPr>
-            <w:tcW w:type="dxa" w:w="720"/>
+            <w:tcW w:type="dxa" w:w="700"/>
             <w:vAlign w:val="center"/>
             <w:tcBorders>
               <w:top w:val="single" w:sz="4" w:space="0" w:color="C9D1D9"/>
@@ -2918,7 +2967,7 @@
             <w:r>
               <w:rPr>
                 <w:rFonts w:ascii="Calibri" w:hAnsi="Calibri"/>
-                <w:sz w:val="18"/>
+                <w:sz w:val="16"/>
               </w:rPr>
               <w:t>scan</w:t>
             </w:r>
@@ -2943,7 +2992,7 @@
             <w:r>
               <w:rPr>
                 <w:rFonts w:ascii="Calibri" w:hAnsi="Calibri"/>
-                <w:sz w:val="18"/>
+                <w:sz w:val="16"/>
               </w:rPr>
               <w:t>AIBL heldout</w:t>
             </w:r>
@@ -2951,7 +3000,7 @@
         </w:tc>
         <w:tc>
           <w:tcPr>
-            <w:tcW w:type="dxa" w:w="850"/>
+            <w:tcW w:type="dxa" w:w="820"/>
             <w:vAlign w:val="center"/>
             <w:tcBorders>
               <w:top w:val="single" w:sz="4" w:space="0" w:color="C9D1D9"/>
@@ -2968,7 +3017,7 @@
             <w:r>
               <w:rPr>
                 <w:rFonts w:ascii="Calibri" w:hAnsi="Calibri"/>
-                <w:sz w:val="18"/>
+                <w:sz w:val="16"/>
               </w:rPr>
               <w:t>397</w:t>
             </w:r>
@@ -2976,7 +3025,7 @@
         </w:tc>
         <w:tc>
           <w:tcPr>
-            <w:tcW w:type="dxa" w:w="720"/>
+            <w:tcW w:type="dxa" w:w="620"/>
             <w:vAlign w:val="center"/>
             <w:tcBorders>
               <w:top w:val="single" w:sz="4" w:space="0" w:color="C9D1D9"/>
@@ -2993,7 +3042,7 @@
             <w:r>
               <w:rPr>
                 <w:rFonts w:ascii="Calibri" w:hAnsi="Calibri"/>
-                <w:sz w:val="18"/>
+                <w:sz w:val="16"/>
               </w:rPr>
               <w:t>0.909</w:t>
             </w:r>
@@ -3001,7 +3050,7 @@
         </w:tc>
         <w:tc>
           <w:tcPr>
-            <w:tcW w:type="dxa" w:w="720"/>
+            <w:tcW w:type="dxa" w:w="620"/>
             <w:vAlign w:val="center"/>
             <w:tcBorders>
               <w:top w:val="single" w:sz="4" w:space="0" w:color="C9D1D9"/>
@@ -3018,7 +3067,7 @@
             <w:r>
               <w:rPr>
                 <w:rFonts w:ascii="Calibri" w:hAnsi="Calibri"/>
-                <w:sz w:val="18"/>
+                <w:sz w:val="16"/>
               </w:rPr>
               <w:t>0.820</w:t>
             </w:r>
@@ -3026,7 +3075,7 @@
         </w:tc>
         <w:tc>
           <w:tcPr>
-            <w:tcW w:type="dxa" w:w="850"/>
+            <w:tcW w:type="dxa" w:w="760"/>
             <w:vAlign w:val="center"/>
             <w:tcBorders>
               <w:top w:val="single" w:sz="4" w:space="0" w:color="C9D1D9"/>
@@ -3043,7 +3092,7 @@
             <w:r>
               <w:rPr>
                 <w:rFonts w:ascii="Calibri" w:hAnsi="Calibri"/>
-                <w:sz w:val="18"/>
+                <w:sz w:val="16"/>
               </w:rPr>
               <w:t>0.939</w:t>
             </w:r>
@@ -3051,7 +3100,7 @@
         </w:tc>
         <w:tc>
           <w:tcPr>
-            <w:tcW w:type="dxa" w:w="1191"/>
+            <w:tcW w:type="dxa" w:w="1180"/>
             <w:vAlign w:val="center"/>
             <w:tcBorders>
               <w:top w:val="single" w:sz="4" w:space="0" w:color="C9D1D9"/>
@@ -3068,7 +3117,7 @@
             <w:r>
               <w:rPr>
                 <w:rFonts w:ascii="Calibri" w:hAnsi="Calibri"/>
-                <w:sz w:val="18"/>
+                <w:sz w:val="16"/>
               </w:rPr>
               <w:t>AD-vs-CN AUC 0.998</w:t>
             </w:r>
@@ -3076,7 +3125,7 @@
         </w:tc>
         <w:tc>
           <w:tcPr>
-            <w:tcW w:type="dxa" w:w="1021"/>
+            <w:tcW w:type="dxa" w:w="1040"/>
             <w:vAlign w:val="center"/>
             <w:tcBorders>
               <w:top w:val="single" w:sz="4" w:space="0" w:color="C9D1D9"/>
@@ -3093,7 +3142,7 @@
             <w:r>
               <w:rPr>
                 <w:rFonts w:ascii="Calibri" w:hAnsi="Calibri"/>
-                <w:sz w:val="18"/>
+                <w:sz w:val="16"/>
               </w:rPr>
               <w:t>0.964/0.642/0.854</w:t>
             </w:r>
@@ -3101,7 +3150,7 @@
         </w:tc>
         <w:tc>
           <w:tcPr>
-            <w:tcW w:type="dxa" w:w="1247"/>
+            <w:tcW w:type="dxa" w:w="1590"/>
             <w:vAlign w:val="center"/>
             <w:tcBorders>
               <w:top w:val="single" w:sz="4" w:space="0" w:color="C9D1D9"/>
@@ -3118,7 +3167,7 @@
             <w:r>
               <w:rPr>
                 <w:rFonts w:ascii="Calibri" w:hAnsi="Calibri"/>
-                <w:sz w:val="18"/>
+                <w:sz w:val="16"/>
               </w:rPr>
               <w:t>Scan-level reference</w:t>
             </w:r>
@@ -3126,9 +3175,12 @@
         </w:tc>
       </w:tr>
       <w:tr>
+        <w:trPr>
+          <w:cantSplit/>
+        </w:trPr>
         <w:tc>
           <w:tcPr>
-            <w:tcW w:type="dxa" w:w="1191"/>
+            <w:tcW w:type="dxa" w:w="1180"/>
             <w:vAlign w:val="center"/>
             <w:tcBorders>
               <w:top w:val="single" w:sz="4" w:space="0" w:color="C9D1D9"/>
@@ -3145,7 +3197,7 @@
             <w:r>
               <w:rPr>
                 <w:rFonts w:ascii="Calibri" w:hAnsi="Calibri"/>
-                <w:sz w:val="18"/>
+                <w:sz w:val="16"/>
               </w:rPr>
               <w:t>Final rescue ensemble</w:t>
             </w:r>
@@ -3153,7 +3205,7 @@
         </w:tc>
         <w:tc>
           <w:tcPr>
-            <w:tcW w:type="dxa" w:w="720"/>
+            <w:tcW w:type="dxa" w:w="700"/>
             <w:vAlign w:val="center"/>
             <w:tcBorders>
               <w:top w:val="single" w:sz="4" w:space="0" w:color="C9D1D9"/>
@@ -3170,7 +3222,7 @@
             <w:r>
               <w:rPr>
                 <w:rFonts w:ascii="Calibri" w:hAnsi="Calibri"/>
-                <w:sz w:val="18"/>
+                <w:sz w:val="16"/>
               </w:rPr>
               <w:t>subject</w:t>
             </w:r>
@@ -3195,7 +3247,7 @@
             <w:r>
               <w:rPr>
                 <w:rFonts w:ascii="Calibri" w:hAnsi="Calibri"/>
-                <w:sz w:val="18"/>
+                <w:sz w:val="16"/>
               </w:rPr>
               <w:t>AIBL heldout</w:t>
             </w:r>
@@ -3203,7 +3255,7 @@
         </w:tc>
         <w:tc>
           <w:tcPr>
-            <w:tcW w:type="dxa" w:w="850"/>
+            <w:tcW w:type="dxa" w:w="820"/>
             <w:vAlign w:val="center"/>
             <w:tcBorders>
               <w:top w:val="single" w:sz="4" w:space="0" w:color="C9D1D9"/>
@@ -3220,7 +3272,7 @@
             <w:r>
               <w:rPr>
                 <w:rFonts w:ascii="Calibri" w:hAnsi="Calibri"/>
-                <w:sz w:val="18"/>
+                <w:sz w:val="16"/>
               </w:rPr>
               <w:t>216</w:t>
             </w:r>
@@ -3228,7 +3280,7 @@
         </w:tc>
         <w:tc>
           <w:tcPr>
-            <w:tcW w:type="dxa" w:w="720"/>
+            <w:tcW w:type="dxa" w:w="620"/>
             <w:vAlign w:val="center"/>
             <w:tcBorders>
               <w:top w:val="single" w:sz="4" w:space="0" w:color="C9D1D9"/>
@@ -3245,7 +3297,7 @@
             <w:r>
               <w:rPr>
                 <w:rFonts w:ascii="Calibri" w:hAnsi="Calibri"/>
-                <w:sz w:val="18"/>
+                <w:sz w:val="16"/>
               </w:rPr>
               <w:t>0.903</w:t>
             </w:r>
@@ -3253,7 +3305,7 @@
         </w:tc>
         <w:tc>
           <w:tcPr>
-            <w:tcW w:type="dxa" w:w="720"/>
+            <w:tcW w:type="dxa" w:w="620"/>
             <w:vAlign w:val="center"/>
             <w:tcBorders>
               <w:top w:val="single" w:sz="4" w:space="0" w:color="C9D1D9"/>
@@ -3270,7 +3322,7 @@
             <w:r>
               <w:rPr>
                 <w:rFonts w:ascii="Calibri" w:hAnsi="Calibri"/>
-                <w:sz w:val="18"/>
+                <w:sz w:val="16"/>
               </w:rPr>
               <w:t>0.833</w:t>
             </w:r>
@@ -3278,7 +3330,7 @@
         </w:tc>
         <w:tc>
           <w:tcPr>
-            <w:tcW w:type="dxa" w:w="850"/>
+            <w:tcW w:type="dxa" w:w="760"/>
             <w:vAlign w:val="center"/>
             <w:tcBorders>
               <w:top w:val="single" w:sz="4" w:space="0" w:color="C9D1D9"/>
@@ -3295,7 +3347,7 @@
             <w:r>
               <w:rPr>
                 <w:rFonts w:ascii="Calibri" w:hAnsi="Calibri"/>
-                <w:sz w:val="18"/>
+                <w:sz w:val="16"/>
               </w:rPr>
               <w:t>0.937</w:t>
             </w:r>
@@ -3303,7 +3355,7 @@
         </w:tc>
         <w:tc>
           <w:tcPr>
-            <w:tcW w:type="dxa" w:w="1191"/>
+            <w:tcW w:type="dxa" w:w="1180"/>
             <w:vAlign w:val="center"/>
             <w:tcBorders>
               <w:top w:val="single" w:sz="4" w:space="0" w:color="C9D1D9"/>
@@ -3320,7 +3372,7 @@
             <w:r>
               <w:rPr>
                 <w:rFonts w:ascii="Calibri" w:hAnsi="Calibri"/>
-                <w:sz w:val="18"/>
+                <w:sz w:val="16"/>
               </w:rPr>
               <w:t>AD-vs-CN AUC 1.000</w:t>
             </w:r>
@@ -3328,7 +3380,7 @@
         </w:tc>
         <w:tc>
           <w:tcPr>
-            <w:tcW w:type="dxa" w:w="1021"/>
+            <w:tcW w:type="dxa" w:w="1040"/>
             <w:vAlign w:val="center"/>
             <w:tcBorders>
               <w:top w:val="single" w:sz="4" w:space="0" w:color="C9D1D9"/>
@@ -3345,7 +3397,7 @@
             <w:r>
               <w:rPr>
                 <w:rFonts w:ascii="Calibri" w:hAnsi="Calibri"/>
-                <w:sz w:val="18"/>
+                <w:sz w:val="16"/>
               </w:rPr>
               <w:t>0.961/0.686/0.852</w:t>
             </w:r>
@@ -3353,7 +3405,7 @@
         </w:tc>
         <w:tc>
           <w:tcPr>
-            <w:tcW w:type="dxa" w:w="1247"/>
+            <w:tcW w:type="dxa" w:w="1590"/>
             <w:vAlign w:val="center"/>
             <w:tcBorders>
               <w:top w:val="single" w:sz="4" w:space="0" w:color="C9D1D9"/>
@@ -3370,7 +3422,7 @@
             <w:r>
               <w:rPr>
                 <w:rFonts w:ascii="Calibri" w:hAnsi="Calibri"/>
-                <w:sz w:val="18"/>
+                <w:sz w:val="16"/>
               </w:rPr>
               <w:t>Locked primary result</w:t>
             </w:r>
@@ -3378,9 +3430,12 @@
         </w:tc>
       </w:tr>
       <w:tr>
+        <w:trPr>
+          <w:cantSplit/>
+        </w:trPr>
         <w:tc>
           <w:tcPr>
-            <w:tcW w:type="dxa" w:w="1191"/>
+            <w:tcW w:type="dxa" w:w="1180"/>
             <w:vAlign w:val="center"/>
             <w:tcBorders>
               <w:top w:val="single" w:sz="4" w:space="0" w:color="C9D1D9"/>
@@ -3397,7 +3452,7 @@
             <w:r>
               <w:rPr>
                 <w:rFonts w:ascii="Calibri" w:hAnsi="Calibri"/>
-                <w:sz w:val="18"/>
+                <w:sz w:val="16"/>
               </w:rPr>
               <w:t>Final rescue ensemble</w:t>
             </w:r>
@@ -3405,7 +3460,7 @@
         </w:tc>
         <w:tc>
           <w:tcPr>
-            <w:tcW w:type="dxa" w:w="720"/>
+            <w:tcW w:type="dxa" w:w="700"/>
             <w:vAlign w:val="center"/>
             <w:tcBorders>
               <w:top w:val="single" w:sz="4" w:space="0" w:color="C9D1D9"/>
@@ -3422,7 +3477,7 @@
             <w:r>
               <w:rPr>
                 <w:rFonts w:ascii="Calibri" w:hAnsi="Calibri"/>
-                <w:sz w:val="18"/>
+                <w:sz w:val="16"/>
               </w:rPr>
               <w:t>subject</w:t>
             </w:r>
@@ -3447,7 +3502,7 @@
             <w:r>
               <w:rPr>
                 <w:rFonts w:ascii="Calibri" w:hAnsi="Calibri"/>
-                <w:sz w:val="18"/>
+                <w:sz w:val="16"/>
               </w:rPr>
               <w:t>IXI healthy</w:t>
             </w:r>
@@ -3455,7 +3510,7 @@
         </w:tc>
         <w:tc>
           <w:tcPr>
-            <w:tcW w:type="dxa" w:w="850"/>
+            <w:tcW w:type="dxa" w:w="820"/>
             <w:vAlign w:val="center"/>
             <w:tcBorders>
               <w:top w:val="single" w:sz="4" w:space="0" w:color="C9D1D9"/>
@@ -3472,7 +3527,7 @@
             <w:r>
               <w:rPr>
                 <w:rFonts w:ascii="Calibri" w:hAnsi="Calibri"/>
-                <w:sz w:val="18"/>
+                <w:sz w:val="16"/>
               </w:rPr>
               <w:t>581</w:t>
             </w:r>
@@ -3480,7 +3535,7 @@
         </w:tc>
         <w:tc>
           <w:tcPr>
-            <w:tcW w:type="dxa" w:w="720"/>
+            <w:tcW w:type="dxa" w:w="620"/>
             <w:vAlign w:val="center"/>
             <w:tcBorders>
               <w:top w:val="single" w:sz="4" w:space="0" w:color="C9D1D9"/>
@@ -3497,7 +3552,7 @@
             <w:r>
               <w:rPr>
                 <w:rFonts w:ascii="Calibri" w:hAnsi="Calibri"/>
-                <w:sz w:val="18"/>
+                <w:sz w:val="16"/>
               </w:rPr>
               <w:t>1.000</w:t>
             </w:r>
@@ -3505,7 +3560,7 @@
         </w:tc>
         <w:tc>
           <w:tcPr>
-            <w:tcW w:type="dxa" w:w="720"/>
+            <w:tcW w:type="dxa" w:w="620"/>
             <w:vAlign w:val="center"/>
             <w:tcBorders>
               <w:top w:val="single" w:sz="4" w:space="0" w:color="C9D1D9"/>
@@ -3522,7 +3577,7 @@
             <w:r>
               <w:rPr>
                 <w:rFonts w:ascii="Calibri" w:hAnsi="Calibri"/>
-                <w:sz w:val="18"/>
+                <w:sz w:val="16"/>
               </w:rPr>
               <w:t>1.000</w:t>
             </w:r>
@@ -3530,7 +3585,7 @@
         </w:tc>
         <w:tc>
           <w:tcPr>
-            <w:tcW w:type="dxa" w:w="850"/>
+            <w:tcW w:type="dxa" w:w="760"/>
             <w:vAlign w:val="center"/>
             <w:tcBorders>
               <w:top w:val="single" w:sz="4" w:space="0" w:color="C9D1D9"/>
@@ -3547,7 +3602,7 @@
             <w:r>
               <w:rPr>
                 <w:rFonts w:ascii="Calibri" w:hAnsi="Calibri"/>
-                <w:sz w:val="18"/>
+                <w:sz w:val="16"/>
               </w:rPr>
               <w:t>NA</w:t>
             </w:r>
@@ -3555,7 +3610,7 @@
         </w:tc>
         <w:tc>
           <w:tcPr>
-            <w:tcW w:type="dxa" w:w="1191"/>
+            <w:tcW w:type="dxa" w:w="1180"/>
             <w:vAlign w:val="center"/>
             <w:tcBorders>
               <w:top w:val="single" w:sz="4" w:space="0" w:color="C9D1D9"/>
@@ -3572,7 +3627,7 @@
             <w:r>
               <w:rPr>
                 <w:rFonts w:ascii="Calibri" w:hAnsi="Calibri"/>
-                <w:sz w:val="18"/>
+                <w:sz w:val="16"/>
               </w:rPr>
               <w:t>CN retention 1.000</w:t>
             </w:r>
@@ -3580,7 +3635,7 @@
         </w:tc>
         <w:tc>
           <w:tcPr>
-            <w:tcW w:type="dxa" w:w="1021"/>
+            <w:tcW w:type="dxa" w:w="1040"/>
             <w:vAlign w:val="center"/>
             <w:tcBorders>
               <w:top w:val="single" w:sz="4" w:space="0" w:color="C9D1D9"/>
@@ -3597,7 +3652,7 @@
             <w:r>
               <w:rPr>
                 <w:rFonts w:ascii="Calibri" w:hAnsi="Calibri"/>
-                <w:sz w:val="18"/>
+                <w:sz w:val="16"/>
               </w:rPr>
               <w:t>1.000/0.000/0.000</w:t>
             </w:r>
@@ -3605,7 +3660,7 @@
         </w:tc>
         <w:tc>
           <w:tcPr>
-            <w:tcW w:type="dxa" w:w="1247"/>
+            <w:tcW w:type="dxa" w:w="1590"/>
             <w:vAlign w:val="center"/>
             <w:tcBorders>
               <w:top w:val="single" w:sz="4" w:space="0" w:color="C9D1D9"/>
@@ -3622,7 +3677,7 @@
             <w:r>
               <w:rPr>
                 <w:rFonts w:ascii="Calibri" w:hAnsi="Calibri"/>
-                <w:sz w:val="18"/>
+                <w:sz w:val="16"/>
               </w:rPr>
               <w:t>Locked specificity check</w:t>
             </w:r>
@@ -3630,9 +3685,12 @@
         </w:tc>
       </w:tr>
       <w:tr>
+        <w:trPr>
+          <w:cantSplit/>
+        </w:trPr>
         <w:tc>
           <w:tcPr>
-            <w:tcW w:type="dxa" w:w="1191"/>
+            <w:tcW w:type="dxa" w:w="1180"/>
             <w:vAlign w:val="center"/>
             <w:tcBorders>
               <w:top w:val="single" w:sz="4" w:space="0" w:color="C9D1D9"/>
@@ -3649,7 +3707,7 @@
             <w:r>
               <w:rPr>
                 <w:rFonts w:ascii="Calibri" w:hAnsi="Calibri"/>
-                <w:sz w:val="18"/>
+                <w:sz w:val="16"/>
               </w:rPr>
               <w:t>Clinical-only RF comparator</w:t>
             </w:r>
@@ -3657,7 +3715,7 @@
         </w:tc>
         <w:tc>
           <w:tcPr>
-            <w:tcW w:type="dxa" w:w="720"/>
+            <w:tcW w:type="dxa" w:w="700"/>
             <w:vAlign w:val="center"/>
             <w:tcBorders>
               <w:top w:val="single" w:sz="4" w:space="0" w:color="C9D1D9"/>
@@ -3674,7 +3732,7 @@
             <w:r>
               <w:rPr>
                 <w:rFonts w:ascii="Calibri" w:hAnsi="Calibri"/>
-                <w:sz w:val="18"/>
+                <w:sz w:val="16"/>
               </w:rPr>
               <w:t>scan</w:t>
             </w:r>
@@ -3699,7 +3757,7 @@
             <w:r>
               <w:rPr>
                 <w:rFonts w:ascii="Calibri" w:hAnsi="Calibri"/>
-                <w:sz w:val="18"/>
+                <w:sz w:val="16"/>
               </w:rPr>
               <w:t>AIBL heldout</w:t>
             </w:r>
@@ -3707,7 +3765,7 @@
         </w:tc>
         <w:tc>
           <w:tcPr>
-            <w:tcW w:type="dxa" w:w="850"/>
+            <w:tcW w:type="dxa" w:w="820"/>
             <w:vAlign w:val="center"/>
             <w:tcBorders>
               <w:top w:val="single" w:sz="4" w:space="0" w:color="C9D1D9"/>
@@ -3724,7 +3782,7 @@
             <w:r>
               <w:rPr>
                 <w:rFonts w:ascii="Calibri" w:hAnsi="Calibri"/>
-                <w:sz w:val="18"/>
+                <w:sz w:val="16"/>
               </w:rPr>
               <w:t>397</w:t>
             </w:r>
@@ -3732,7 +3790,7 @@
         </w:tc>
         <w:tc>
           <w:tcPr>
-            <w:tcW w:type="dxa" w:w="720"/>
+            <w:tcW w:type="dxa" w:w="620"/>
             <w:vAlign w:val="center"/>
             <w:tcBorders>
               <w:top w:val="single" w:sz="4" w:space="0" w:color="C9D1D9"/>
@@ -3749,7 +3807,7 @@
             <w:r>
               <w:rPr>
                 <w:rFonts w:ascii="Calibri" w:hAnsi="Calibri"/>
-                <w:sz w:val="18"/>
+                <w:sz w:val="16"/>
               </w:rPr>
               <w:t>0.922</w:t>
             </w:r>
@@ -3757,7 +3815,7 @@
         </w:tc>
         <w:tc>
           <w:tcPr>
-            <w:tcW w:type="dxa" w:w="720"/>
+            <w:tcW w:type="dxa" w:w="620"/>
             <w:vAlign w:val="center"/>
             <w:tcBorders>
               <w:top w:val="single" w:sz="4" w:space="0" w:color="C9D1D9"/>
@@ -3774,7 +3832,7 @@
             <w:r>
               <w:rPr>
                 <w:rFonts w:ascii="Calibri" w:hAnsi="Calibri"/>
-                <w:sz w:val="18"/>
+                <w:sz w:val="16"/>
               </w:rPr>
               <w:t>0.835</w:t>
             </w:r>
@@ -3782,7 +3840,7 @@
         </w:tc>
         <w:tc>
           <w:tcPr>
-            <w:tcW w:type="dxa" w:w="850"/>
+            <w:tcW w:type="dxa" w:w="760"/>
             <w:vAlign w:val="center"/>
             <w:tcBorders>
               <w:top w:val="single" w:sz="4" w:space="0" w:color="C9D1D9"/>
@@ -3799,7 +3857,7 @@
             <w:r>
               <w:rPr>
                 <w:rFonts w:ascii="Calibri" w:hAnsi="Calibri"/>
-                <w:sz w:val="18"/>
+                <w:sz w:val="16"/>
               </w:rPr>
               <w:t>0.957</w:t>
             </w:r>
@@ -3807,7 +3865,7 @@
         </w:tc>
         <w:tc>
           <w:tcPr>
-            <w:tcW w:type="dxa" w:w="1191"/>
+            <w:tcW w:type="dxa" w:w="1180"/>
             <w:vAlign w:val="center"/>
             <w:tcBorders>
               <w:top w:val="single" w:sz="4" w:space="0" w:color="C9D1D9"/>
@@ -3824,7 +3882,7 @@
             <w:r>
               <w:rPr>
                 <w:rFonts w:ascii="Calibri" w:hAnsi="Calibri"/>
-                <w:sz w:val="18"/>
+                <w:sz w:val="16"/>
               </w:rPr>
               <w:t>AD-vs-CN AUC 0.997</w:t>
             </w:r>
@@ -3832,7 +3890,7 @@
         </w:tc>
         <w:tc>
           <w:tcPr>
-            <w:tcW w:type="dxa" w:w="1021"/>
+            <w:tcW w:type="dxa" w:w="1040"/>
             <w:vAlign w:val="center"/>
             <w:tcBorders>
               <w:top w:val="single" w:sz="4" w:space="0" w:color="C9D1D9"/>
@@ -3849,7 +3907,7 @@
             <w:r>
               <w:rPr>
                 <w:rFonts w:ascii="Calibri" w:hAnsi="Calibri"/>
-                <w:sz w:val="18"/>
+                <w:sz w:val="16"/>
               </w:rPr>
               <w:t>0.970/0.755/0.780</w:t>
             </w:r>
@@ -3857,7 +3915,7 @@
         </w:tc>
         <w:tc>
           <w:tcPr>
-            <w:tcW w:type="dxa" w:w="1247"/>
+            <w:tcW w:type="dxa" w:w="1590"/>
             <w:vAlign w:val="center"/>
             <w:tcBorders>
               <w:top w:val="single" w:sz="4" w:space="0" w:color="C9D1D9"/>
@@ -3874,7 +3932,7 @@
             <w:r>
               <w:rPr>
                 <w:rFonts w:ascii="Calibri" w:hAnsi="Calibri"/>
-                <w:sz w:val="18"/>
+                <w:sz w:val="16"/>
               </w:rPr>
               <w:t>Comparator/upper bound</w:t>
             </w:r>
@@ -3971,16 +4029,20 @@
         </w:tblCellMar>
       </w:tblPr>
       <w:tblGrid>
-        <w:gridCol w:w="1950"/>
-        <w:gridCol w:w="1950"/>
-        <w:gridCol w:w="1950"/>
-        <w:gridCol w:w="1950"/>
-        <w:gridCol w:w="1560"/>
+        <w:gridCol w:w="1800"/>
+        <w:gridCol w:w="1900"/>
+        <w:gridCol w:w="1900"/>
+        <w:gridCol w:w="1900"/>
+        <w:gridCol w:w="1860"/>
       </w:tblGrid>
       <w:tr>
+        <w:trPr>
+          <w:cantSplit/>
+          <w:tblHeader w:val="true"/>
+        </w:trPr>
         <w:tc>
           <w:tcPr>
-            <w:tcW w:type="dxa" w:w="1950"/>
+            <w:tcW w:type="dxa" w:w="1800"/>
             <w:vAlign w:val="center"/>
             <w:tcBorders>
               <w:top w:val="single" w:sz="4" w:space="0" w:color="C9D1D9"/>
@@ -4008,7 +4070,7 @@
         </w:tc>
         <w:tc>
           <w:tcPr>
-            <w:tcW w:type="dxa" w:w="1950"/>
+            <w:tcW w:type="dxa" w:w="1900"/>
             <w:vAlign w:val="center"/>
             <w:tcBorders>
               <w:top w:val="single" w:sz="4" w:space="0" w:color="C9D1D9"/>
@@ -4036,7 +4098,7 @@
         </w:tc>
         <w:tc>
           <w:tcPr>
-            <w:tcW w:type="dxa" w:w="1950"/>
+            <w:tcW w:type="dxa" w:w="1900"/>
             <w:vAlign w:val="center"/>
             <w:tcBorders>
               <w:top w:val="single" w:sz="4" w:space="0" w:color="C9D1D9"/>
@@ -4064,7 +4126,7 @@
         </w:tc>
         <w:tc>
           <w:tcPr>
-            <w:tcW w:type="dxa" w:w="1950"/>
+            <w:tcW w:type="dxa" w:w="1900"/>
             <w:vAlign w:val="center"/>
             <w:tcBorders>
               <w:top w:val="single" w:sz="4" w:space="0" w:color="C9D1D9"/>
@@ -4092,7 +4154,7 @@
         </w:tc>
         <w:tc>
           <w:tcPr>
-            <w:tcW w:type="dxa" w:w="1560"/>
+            <w:tcW w:type="dxa" w:w="1860"/>
             <w:vAlign w:val="center"/>
             <w:tcBorders>
               <w:top w:val="single" w:sz="4" w:space="0" w:color="C9D1D9"/>
@@ -4120,9 +4182,12 @@
         </w:tc>
       </w:tr>
       <w:tr>
+        <w:trPr>
+          <w:cantSplit/>
+        </w:trPr>
         <w:tc>
           <w:tcPr>
-            <w:tcW w:type="dxa" w:w="1950"/>
+            <w:tcW w:type="dxa" w:w="1800"/>
             <w:vAlign w:val="center"/>
             <w:tcBorders>
               <w:top w:val="single" w:sz="4" w:space="0" w:color="C9D1D9"/>
@@ -4147,7 +4212,7 @@
         </w:tc>
         <w:tc>
           <w:tcPr>
-            <w:tcW w:type="dxa" w:w="1950"/>
+            <w:tcW w:type="dxa" w:w="1900"/>
             <w:vAlign w:val="center"/>
             <w:tcBorders>
               <w:top w:val="single" w:sz="4" w:space="0" w:color="C9D1D9"/>
@@ -4172,7 +4237,7 @@
         </w:tc>
         <w:tc>
           <w:tcPr>
-            <w:tcW w:type="dxa" w:w="1950"/>
+            <w:tcW w:type="dxa" w:w="1900"/>
             <w:vAlign w:val="center"/>
             <w:tcBorders>
               <w:top w:val="single" w:sz="4" w:space="0" w:color="C9D1D9"/>
@@ -4197,7 +4262,7 @@
         </w:tc>
         <w:tc>
           <w:tcPr>
-            <w:tcW w:type="dxa" w:w="1950"/>
+            <w:tcW w:type="dxa" w:w="1900"/>
             <w:vAlign w:val="center"/>
             <w:tcBorders>
               <w:top w:val="single" w:sz="4" w:space="0" w:color="C9D1D9"/>
@@ -4222,7 +4287,7 @@
         </w:tc>
         <w:tc>
           <w:tcPr>
-            <w:tcW w:type="dxa" w:w="1560"/>
+            <w:tcW w:type="dxa" w:w="1860"/>
             <w:vAlign w:val="center"/>
             <w:tcBorders>
               <w:top w:val="single" w:sz="4" w:space="0" w:color="C9D1D9"/>
@@ -4247,9 +4312,12 @@
         </w:tc>
       </w:tr>
       <w:tr>
+        <w:trPr>
+          <w:cantSplit/>
+        </w:trPr>
         <w:tc>
           <w:tcPr>
-            <w:tcW w:type="dxa" w:w="1950"/>
+            <w:tcW w:type="dxa" w:w="1800"/>
             <w:vAlign w:val="center"/>
             <w:tcBorders>
               <w:top w:val="single" w:sz="4" w:space="0" w:color="C9D1D9"/>
@@ -4274,7 +4342,7 @@
         </w:tc>
         <w:tc>
           <w:tcPr>
-            <w:tcW w:type="dxa" w:w="1950"/>
+            <w:tcW w:type="dxa" w:w="1900"/>
             <w:vAlign w:val="center"/>
             <w:tcBorders>
               <w:top w:val="single" w:sz="4" w:space="0" w:color="C9D1D9"/>
@@ -4299,7 +4367,7 @@
         </w:tc>
         <w:tc>
           <w:tcPr>
-            <w:tcW w:type="dxa" w:w="1950"/>
+            <w:tcW w:type="dxa" w:w="1900"/>
             <w:vAlign w:val="center"/>
             <w:tcBorders>
               <w:top w:val="single" w:sz="4" w:space="0" w:color="C9D1D9"/>
@@ -4324,7 +4392,7 @@
         </w:tc>
         <w:tc>
           <w:tcPr>
-            <w:tcW w:type="dxa" w:w="1950"/>
+            <w:tcW w:type="dxa" w:w="1900"/>
             <w:vAlign w:val="center"/>
             <w:tcBorders>
               <w:top w:val="single" w:sz="4" w:space="0" w:color="C9D1D9"/>
@@ -4349,7 +4417,7 @@
         </w:tc>
         <w:tc>
           <w:tcPr>
-            <w:tcW w:type="dxa" w:w="1560"/>
+            <w:tcW w:type="dxa" w:w="1860"/>
             <w:vAlign w:val="center"/>
             <w:tcBorders>
               <w:top w:val="single" w:sz="4" w:space="0" w:color="C9D1D9"/>
@@ -4374,9 +4442,12 @@
         </w:tc>
       </w:tr>
       <w:tr>
+        <w:trPr>
+          <w:cantSplit/>
+        </w:trPr>
         <w:tc>
           <w:tcPr>
-            <w:tcW w:type="dxa" w:w="1950"/>
+            <w:tcW w:type="dxa" w:w="1800"/>
             <w:vAlign w:val="center"/>
             <w:tcBorders>
               <w:top w:val="single" w:sz="4" w:space="0" w:color="C9D1D9"/>
@@ -4401,7 +4472,7 @@
         </w:tc>
         <w:tc>
           <w:tcPr>
-            <w:tcW w:type="dxa" w:w="1950"/>
+            <w:tcW w:type="dxa" w:w="1900"/>
             <w:vAlign w:val="center"/>
             <w:tcBorders>
               <w:top w:val="single" w:sz="4" w:space="0" w:color="C9D1D9"/>
@@ -4426,7 +4497,7 @@
         </w:tc>
         <w:tc>
           <w:tcPr>
-            <w:tcW w:type="dxa" w:w="1950"/>
+            <w:tcW w:type="dxa" w:w="1900"/>
             <w:vAlign w:val="center"/>
             <w:tcBorders>
               <w:top w:val="single" w:sz="4" w:space="0" w:color="C9D1D9"/>
@@ -4451,7 +4522,7 @@
         </w:tc>
         <w:tc>
           <w:tcPr>
-            <w:tcW w:type="dxa" w:w="1950"/>
+            <w:tcW w:type="dxa" w:w="1900"/>
             <w:vAlign w:val="center"/>
             <w:tcBorders>
               <w:top w:val="single" w:sz="4" w:space="0" w:color="C9D1D9"/>
@@ -4476,7 +4547,7 @@
         </w:tc>
         <w:tc>
           <w:tcPr>
-            <w:tcW w:type="dxa" w:w="1560"/>
+            <w:tcW w:type="dxa" w:w="1860"/>
             <w:vAlign w:val="center"/>
             <w:tcBorders>
               <w:top w:val="single" w:sz="4" w:space="0" w:color="C9D1D9"/>
@@ -4871,7 +4942,7 @@
           <w:rFonts w:ascii="Calibri" w:hAnsi="Calibri"/>
           <w:sz w:val="22"/>
         </w:rPr>
-        <w:t>References to add</w:t>
+        <w:t>References</w:t>
       </w:r>
     </w:p>
     <w:p>

</xml_diff>